<commit_message>
feat: add phone gyroscope teleoperation
</commit_message>
<xml_diff>
--- a/Seeed-Studio/Seeed_Studio_Wiki项目分析与手机遥操机械臂原理.docx
+++ b/Seeed-Studio/Seeed_Studio_Wiki项目分析与手机遥操机械臂原理.docx
@@ -44,7 +44,7 @@
           <w:color w:val="2E74B5"/>
           <w:sz w:val="48"/>
         </w:rPr>
-        <w:t>与手机遥操机械臂原理</w:t>
+        <w:t>与手机陀螺仪遥操的证据边界</w:t>
       </w:r>
     </w:p>
     <w:p>
@@ -58,7 +58,7 @@
           <w:color w:val="667085"/>
           <w:sz w:val="25"/>
         </w:rPr>
-        <w:t>从 Docusaurus 文档平台，到 Phosphobot、逆运动学与 Feetech 舵机执行链</w:t>
+        <w:t>从 Docusaurus 文档平台，到 Phosphobot VR、LeRobot Phone 与 LM3-UP 原生 IMU 适配</w:t>
       </w:r>
     </w:p>
     <w:p>
@@ -86,7 +86,7 @@
           <w:rFonts w:ascii="Calibri" w:hAnsi="Calibri" w:eastAsia="Microsoft YaHei"/>
           <w:color w:val="202124"/>
         </w:rPr>
-        <w:t>目标仓库是 Seeed Studio 的多语言文档站，而不是机械臂控制程序。手机遥操的实际执行代码位于 Wiki 链接的 Phosphobot 项目中：手机网页发送末端位姿增量，电脑完成运动学计算，再通过 USB 串口控制 SO-ARM 舵机。</w:t>
+        <w:t>Seeed Studio Wiki 是多语言文档站，不包含手机陀螺仪控制代码。Phosphobot 的空间遥操对象是 Meta Quest/VR；本仓库另行实现 Android/HarmonyOS Rotation Vector → LM3 TCP 姿态增量，并保留触屏 XYZ。</w:t>
       </w:r>
     </w:p>
     <w:p>
@@ -127,7 +127,7 @@
           <w:color w:val="667085"/>
           <w:sz w:val="20"/>
         </w:rPr>
-        <w:t>生成日期：2026-08-08</w:t>
+        <w:t>修订日期：2026-08-09</w:t>
       </w:r>
     </w:p>
     <w:p>
@@ -166,7 +166,7 @@
           <w:i w:val="0"/>
           <w:color w:val="202124"/>
         </w:rPr>
-        <w:t>对于“手机控制机械臂”，当前源码能够证明的实现不是一个 SO-ARM 专用原生手机 App，而是手机通过浏览器访问运行在电脑上的 Phosphobot 控制页面。网页已经实现触摸事件，后端默认监听局域网接口，因此手机可作为触屏遥控终端。</w:t>
+        <w:t>对于“手机陀螺仪控制机械臂”，Seeed Wiki 与 Phosphobot 源码都没有提供现成实现。Phosphobot 的 WebSocket 遥操模型明确用于 Meta Quest/VR；本仓库的 Android 与 HarmonyOS 客户端才负责读取手机 Rotation Vector。</w:t>
       </w:r>
     </w:p>
     <w:p>
@@ -226,7 +226,7 @@
           <w:rFonts w:ascii="Calibri" w:hAnsi="Calibri" w:eastAsia="Microsoft YaHei"/>
           <w:color w:val="202124"/>
         </w:rPr>
-        <w:t>Phosphobot：检查手机可用的触摸 UI、REST/WebSocket/UDP 控制接口、运动学层和 SO-ARM 舵机总线。</w:t>
+        <w:t>Phosphobot：检查 Meta Quest VR 页面、WebSocket/UDP 遥操接口、坐标映射、运动学层和 SO-ARM 硬件链。</w:t>
       </w:r>
     </w:p>
     <w:p>
@@ -238,7 +238,7 @@
           <w:rFonts w:ascii="Calibri" w:hAnsi="Calibri" w:eastAsia="Microsoft YaHei"/>
           <w:color w:val="202124"/>
         </w:rPr>
-        <w:t>验证状态：目标 Wiki 工作树干净，关键 JavaScript 配置通过语法检查。</w:t>
+        <w:t>验证状态：Wiki 固定提交、Phosphobot VR 控制页与 AppControlData、LeRobot v0.4.2 Phone Teleoperator，以及本仓库 Android/HarmonyOS Rotation Vector 路径均已做源码核对。</w:t>
       </w:r>
     </w:p>
     <w:p>
@@ -250,7 +250,7 @@
           <w:rFonts w:ascii="Calibri" w:hAnsi="Calibri" w:eastAsia="Microsoft YaHei"/>
           <w:color w:val="202124"/>
         </w:rPr>
-        <w:t>未执行：当前环境没有 Yarn 和 node_modules，因此未安装依赖或运行五语言完整构建；也未连接真实手机和机械臂进行端到端测试。</w:t>
+        <w:t>未执行：未连接真实手机、LM3-UP 或 SO-ARM 做运动测试；手机传感器手感、无线时延、轴向和真机停止效果仍须实机低速验收。</w:t>
       </w:r>
     </w:p>
     <w:p>
@@ -2314,7 +2314,7 @@
           <w:i w:val="0"/>
           <w:color w:val="202124"/>
         </w:rPr>
-        <w:t>Wiki 页面没有给出 SO-ARM 专用手机应用、手机协议或手机手势识别实现。手机网页遥操能力是根据其链接的 Phosphobot 源码确认的：控制页面支持 onTouchStart、onTouchEnd 和 onTouchCancel，并使用当前页面的主机名和端口向后端发送控制请求。</w:t>
+        <w:t>Wiki 页面没有给出 SO-ARM 专用手机应用、手机陀螺仪协议或原生传感器实现。Phosphobot 控制页列出的空间遥操设备是 Meta Quest 2/Pro/3/3S；其 AppControlData 注释也明确写为 Meta Quest 数据。</w:t>
       </w:r>
     </w:p>
     <w:p>
@@ -2342,7 +2342,7 @@
           <w:rFonts w:ascii="Calibri" w:hAnsi="Calibri" w:eastAsia="Microsoft YaHei"/>
           <w:color w:val="202124"/>
         </w:rPr>
-        <w:t>因此，“手机遥操机械臂”更准确的描述是：手机作为浏览器输入设备，电脑作为控制服务器与运动学计算节点，机械臂仍通过 USB 串口连接电脑。</w:t>
+        <w:t>不能把 Seeed/Phosphobot 写成已经实现手机陀螺仪。可复用的是“移动端表达末端意图，机器人侧负责坐标、运动学和硬件”的架构，而不是其输入设备或安全策略。</w:t>
       </w:r>
     </w:p>
     <w:p>
@@ -2355,7 +2355,7 @@
         <w:pStyle w:val="Heading1"/>
       </w:pPr>
       <w:r>
-        <w:t>6. 手机遥操机械臂的完整控制链</w:t>
+        <w:t>6. 从参考项目到 LM3-UP 手机陀螺仪遥操</w:t>
       </w:r>
     </w:p>
     <w:p>
@@ -2368,7 +2368,7 @@
           <w:i w:val="0"/>
           <w:color w:val="202124"/>
         </w:rPr>
-        <w:t>手机并不直接与六个舵机通信。它只负责产生操作意图；电脑完成网络服务、坐标转换、运动学求解和串口下发。</w:t>
+        <w:t>手机不直接与机械臂关节通信。本仓库读取系统融合后的 Rotation Vector，把相邻旋转增量作为 TCP 姿态意图；电脑上的安全桥负责认证、时序、限幅、看门狗和 LM3 硬件调用。</w:t>
       </w:r>
     </w:p>
     <w:p>
@@ -2379,7 +2379,7 @@
         <w:drawing>
           <wp:inline xmlns:a="http://schemas.openxmlformats.org/drawingml/2006/main" xmlns:pic="http://schemas.openxmlformats.org/drawingml/2006/picture">
             <wp:extent cx="5806440" cy="3741928"/>
-            <wp:docPr id="1" name="Picture 1" descr="手机浏览器通过局域网、Phosphobot、逆运动学和 USB 串口控制 SO-ARM 舵机的流程图" title="手机遥操 SO-ARM 实际控制链"/>
+            <wp:docPr id="1" name="Picture 1" descr="LM3-UP 手机陀螺仪遥操链：Android/HarmonyOS Rotation Vector 经 WebSocket 安全桥和 pylebai 控制 LM3，云迹 UP 底盘保持停止锁定。" title="LM3-UP 手机陀螺仪遥操与安全控制链"/>
             <wp:cNvGraphicFramePr>
               <a:graphicFrameLocks noChangeAspect="1"/>
             </wp:cNvGraphicFramePr>
@@ -2387,11 +2387,11 @@
               <a:graphicData uri="http://schemas.openxmlformats.org/drawingml/2006/picture">
                 <pic:pic>
                   <pic:nvPicPr>
-                    <pic:cNvPr id="0" name="phone_teleop_flow.png"/>
+                    <pic:cNvPr id="0" name="seeed-docx-gyro-diagram.png"/>
                     <pic:cNvPicPr/>
                   </pic:nvPicPr>
                   <pic:blipFill>
-                    <a:blip r:embed="rId11"/>
+                    <a:blip r:embed="rId20"/>
                     <a:stretch>
                       <a:fillRect/>
                     </a:stretch>
@@ -2416,7 +2416,7 @@
         <w:jc w:val="center"/>
       </w:pPr>
       <w:r>
-        <w:t>图 1  手机浏览器到 SO-ARM 舵机的控制链</w:t>
+        <w:t>图 1  本仓库 LM3-UP 手机陀螺仪遥操与安全控制链</w:t>
       </w:r>
     </w:p>
     <w:p>
@@ -2424,7 +2424,7 @@
         <w:pStyle w:val="Heading2"/>
       </w:pPr>
       <w:r>
-        <w:t>6.1 网络拓扑</w:t>
+        <w:t>6.1 技术边界与网络拓扑</w:t>
       </w:r>
     </w:p>
     <w:p>
@@ -2437,7 +2437,7 @@
           <w:i w:val="0"/>
           <w:color w:val="202124"/>
         </w:rPr>
-        <w:t>机械臂通过 USB 接到电脑；手机与电脑连接同一个 Wi-Fi 或有线/无线局域网。Phosphobot 默认绑定 0.0.0.0，表示监听电脑的所有网络接口。手机应访问电脑的真实局域网地址，例如：http://192.168.1.35:8020。</w:t>
+        <w:t>Android/HarmonyOS 手机通过受控局域网连接 Python WebSocket 安全桥；安全桥默认只监听 127.0.0.1，局域网使用必须双重显式开启并配置强 token。生产部署应使用 WSS/TLS，不能照搬上游的 0.0.0.0 和宽松 CORS。</w:t>
       </w:r>
     </w:p>
     <w:p>
@@ -2465,7 +2465,7 @@
           <w:rFonts w:ascii="Calibri" w:hAnsi="Calibri" w:eastAsia="Microsoft YaHei"/>
           <w:color w:val="202124"/>
         </w:rPr>
-        <w:t>0.0.0.0 是服务器绑定地址，不是手机可访问的目标地址。Wiki 中的 http://0.0.0.0:8020 对手机用户而言应替换为电脑局域网 IP。</w:t>
+        <w:t>0.0.0.0 只是监听地址，不是手机目标地址。本仓库默认只监听 127.0.0.1；需要实体手机时必须在受控局域网中显式启用监听、使用真实网关地址和强 token。</w:t>
       </w:r>
     </w:p>
     <w:p>
@@ -2486,7 +2486,7 @@
           <w:i w:val="0"/>
           <w:color w:val="202124"/>
         </w:rPr>
-        <w:t>Phosphobot 网页把触摸按钮映射为末端执行器的平移、旋转和夹爪开度。页面内部以 10ms 定时器检查按键状态，但通过节流将发送频率限制在约 30 条指令/秒。</w:t>
+        <w:t>手机端采用系统融合后的 Rotation Vector，而不是直接积分原始角速度。归零后仅发送相邻姿态的最短旋转增量、传感器毫秒时间、校准 ID、跟踪状态和置信度；最多 20 条/秒。XYZ 平移仍由触屏轴键控制。</w:t>
       </w:r>
     </w:p>
     <w:tbl>
@@ -2647,7 +2647,7 @@
                 <w:color w:val="202124"/>
                 <w:sz w:val="19"/>
               </w:rPr>
-              <w:t>x、y、z</w:t>
+              <w:t>angular_delta_rad.rx/ry/rz</w:t>
             </w:r>
           </w:p>
         </w:tc>
@@ -2680,7 +2680,7 @@
                 <w:color w:val="202124"/>
                 <w:sz w:val="19"/>
               </w:rPr>
-              <w:t>末端执行器在笛卡尔空间的相对位移</w:t>
+              <w:t>相邻有效姿态样本的最短旋转增量</w:t>
             </w:r>
           </w:p>
         </w:tc>
@@ -2713,7 +2713,7 @@
                 <w:color w:val="202124"/>
                 <w:sz w:val="19"/>
               </w:rPr>
-              <w:t>厘米输入，后端转为米</w:t>
+              <w:t>弧度</w:t>
             </w:r>
           </w:p>
         </w:tc>
@@ -2749,7 +2749,7 @@
                 <w:color w:val="202124"/>
                 <w:sz w:val="19"/>
               </w:rPr>
-              <w:t>rx、ry、rz</w:t>
+              <w:t>sensor_timestamp_ms</w:t>
             </w:r>
           </w:p>
         </w:tc>
@@ -2782,7 +2782,7 @@
                 <w:color w:val="202124"/>
                 <w:sz w:val="19"/>
               </w:rPr>
-              <w:t>末端姿态 Pitch、Yaw、Roll 的相对变化</w:t>
+              <w:t>手机传感器单调时间；只用于顺序与间隔</w:t>
             </w:r>
           </w:p>
         </w:tc>
@@ -2815,7 +2815,7 @@
                 <w:color w:val="202124"/>
                 <w:sz w:val="19"/>
               </w:rPr>
-              <w:t>角度输入，后端转为弧度</w:t>
+              <w:t>毫秒</w:t>
             </w:r>
           </w:p>
         </w:tc>
@@ -2851,7 +2851,7 @@
                 <w:color w:val="202124"/>
                 <w:sz w:val="19"/>
               </w:rPr>
-              <w:t>open</w:t>
+              <w:t>calibration_id / tracking_state / confidence</w:t>
             </w:r>
           </w:p>
         </w:tc>
@@ -2884,7 +2884,7 @@
                 <w:color w:val="202124"/>
                 <w:sz w:val="19"/>
               </w:rPr>
-              <w:t>夹爪开度；0 为闭合，1 为完全打开</w:t>
+              <w:t>显式归零批次、跟踪状态与质量</w:t>
             </w:r>
           </w:p>
         </w:tc>
@@ -2917,7 +2917,7 @@
                 <w:color w:val="202124"/>
                 <w:sz w:val="19"/>
               </w:rPr>
-              <w:t>0～1 归一化值</w:t>
+              <w:t>字符串 / 0～1</w:t>
             </w:r>
           </w:p>
         </w:tc>
@@ -2953,7 +2953,7 @@
                 <w:color w:val="202124"/>
                 <w:sz w:val="19"/>
               </w:rPr>
-              <w:t>robot_id</w:t>
+              <w:t>lease_id / deadman / frame / mapping</w:t>
             </w:r>
           </w:p>
         </w:tc>
@@ -2986,7 +2986,7 @@
                 <w:color w:val="202124"/>
                 <w:sz w:val="19"/>
               </w:rPr>
-              <w:t>目标机械臂编号</w:t>
+              <w:t>运动授权与固定语义</w:t>
             </w:r>
           </w:p>
         </w:tc>
@@ -3019,7 +3019,7 @@
                 <w:color w:val="202124"/>
                 <w:sz w:val="19"/>
               </w:rPr>
-              <w:t>查询参数</w:t>
+              <w:t>phone_calibrated / tcp_orientation</w:t>
             </w:r>
           </w:p>
         </w:tc>
@@ -3040,7 +3040,7 @@
         <w:pStyle w:val="Heading1"/>
       </w:pPr>
       <w:r>
-        <w:t>7. 从触屏增量到真实关节角</w:t>
+        <w:t>7. 从 Rotation Vector 到 LM3 TCP 角速度</w:t>
       </w:r>
     </w:p>
     <w:p>
@@ -3048,7 +3048,7 @@
         <w:pStyle w:val="Heading2"/>
       </w:pPr>
       <w:r>
-        <w:t>7.1 相对位姿合成</w:t>
+        <w:t>7.1 归零与相邻姿态增量</w:t>
       </w:r>
     </w:p>
     <w:p>
@@ -3061,7 +3061,7 @@
           <w:i w:val="0"/>
           <w:color w:val="202124"/>
         </w:rPr>
-        <w:t>手机发来的不是关节角，而是末端执行器的增量。后端首先把厘米转换为米，然后取得当前末端位姿，并叠加本次增量：</w:t>
+        <w:t>操作者保持标准握持姿态并显式归零。每个 calibration_id 的首帧只建立基线，不运动；之后只比较相邻的有效四元数样本，不把手机绝对朝向直接写给机械臂。</w:t>
       </w:r>
     </w:p>
     <w:p>
@@ -3076,7 +3076,7 @@
           <w:color w:val="183B56"/>
           <w:sz w:val="26"/>
         </w:rPr>
-        <w:t>目标位置  pₜ = p当前 + Δp</w:t>
+        <w:t>控制量  Δrₖ = shortest_rotation(qₖ₋₁, qₖ)</w:t>
       </w:r>
     </w:p>
     <w:p>
@@ -3089,7 +3089,7 @@
           <w:i w:val="0"/>
           <w:color w:val="202124"/>
         </w:rPr>
-        <w:t>例如当前末端 X 坐标为 0.20m，手机发送 ΔX=1cm，则新的目标坐标为 0.21m。旋转量采用类似方法叠加。</w:t>
+        <w:t>服务端依据相邻传感器时间计算角速度，并检查时间严格递增、20～150ms 间隔、有限数值、置信度、单帧跳变和最大角速度。任一检查失败都停止并撤销租约。</w:t>
       </w:r>
     </w:p>
     <w:p>
@@ -3097,7 +3097,7 @@
         <w:pStyle w:val="Heading2"/>
       </w:pPr>
       <w:r>
-        <w:t>7.2 正运动学和逆运动学</w:t>
+        <w:t>7.2 坐标语义与机器人侧执行</w:t>
       </w:r>
     </w:p>
     <w:p>
@@ -3110,7 +3110,7 @@
           <w:i w:val="0"/>
           <w:color w:val="202124"/>
         </w:rPr>
-        <w:t>正运动学把当前关节角转换成末端位置；逆运动学则把目标末端位姿转换成各关节目标角。Phosphobot 加载 SO-ARM URDF，通过 PyBullet 求解逆运动学，并输出受控关节的弧度值。</w:t>
+        <w:t>手机坐标必须先在模拟器中验证并映射到 TCP rx/ry/rz。Python 安全桥把合法旋转增量转换为零线速度、受限角速度的笛卡尔命令，再通过 pylebai 调用 LM3 控制器；逆解和底层关节控制不在手机执行。</w:t>
       </w:r>
     </w:p>
     <w:p>
@@ -3131,14 +3131,13 @@
           <w:b/>
           <w:color w:val="2E74B5"/>
         </w:rPr>
-        <w:t xml:space="preserve">为什么需要 IK  </w:t>
+        <w:t>为什么不在手机算 IK  手机只负责表达姿态变化，机械臂状态、关节限位、TCP 工作空间和停止语义只能由靠近机器人且持有真实反馈的安全桥统一裁决。</w:t>
       </w:r>
       <w:r>
         <w:rPr>
           <w:rFonts w:ascii="Calibri" w:hAnsi="Calibri" w:eastAsia="Microsoft YaHei"/>
           <w:color w:val="202124"/>
         </w:rPr>
-        <w:t>手机只知道“夹爪向前移动 1cm”，而机械臂真正能执行的是肩部、肘部和腕部各自转动多少度。逆运动学负责完成这个转换。</w:t>
       </w:r>
     </w:p>
     <w:p>
@@ -3146,7 +3145,7 @@
         <w:pStyle w:val="Heading2"/>
       </w:pPr>
       <w:r>
-        <w:t>7.3 校准映射</w:t>
+        <w:t>7.3 校准与轴向映射</w:t>
       </w:r>
     </w:p>
     <w:p>
@@ -3159,7 +3158,7 @@
           <w:i w:val="0"/>
           <w:color w:val="202124"/>
         </w:rPr>
-        <w:t>逆运动学输出弧度后，软件根据每个舵机的零点偏移和方向符号换算为 12 位舵机位置单位。其核心关系可以理解为：</w:t>
+        <w:t>Rotation Vector 使用手机设备坐标。标准握持为屏幕朝上、手机顶部指向机器人基坐标 +X；固定映射为 [tcp_rx,tcp_ry,tcp_rz]=[phone_y,-phone_x,phone_z]。更换屏幕方向、安装方式或设备后都要重新归零并在模拟器验向。</w:t>
       </w:r>
     </w:p>
     <w:p>
@@ -3174,7 +3173,7 @@
           <w:color w:val="183B56"/>
           <w:sz w:val="25"/>
         </w:rPr>
-        <w:t>舵机值 = 关节弧度 × 方向符号 × 4095/(2π) + 零点偏移</w:t>
+        <w:t>输出约束 = 固定轴映射 × 相邻旋转向量 × 安全增益，再由服务端按 max_angular_rps 限幅</w:t>
       </w:r>
     </w:p>
     <w:p>
@@ -3182,7 +3181,7 @@
         <w:pStyle w:val="Heading2"/>
       </w:pPr>
       <w:r>
-        <w:t>7.4 USB 串口与舵机执行</w:t>
+        <w:t>7.4 pylebai 与 LM3 执行</w:t>
       </w:r>
     </w:p>
     <w:p>
@@ -3195,7 +3194,7 @@
           <w:i w:val="0"/>
           <w:color w:val="202124"/>
         </w:rPr>
-        <w:t>SO-ARM 定义了 1～6 号 Feetech STS3215 舵机，串行总线波特率为 1,000,000。软件使用 FeetechMotorsBus 批量写入 Goal_Position；舵机内部位置闭环负责驱动电机追踪目标。第六个舵机通常用于夹爪。</w:t>
+        <w:t>桥接器使用有限持续时间的笛卡尔速度接口，并在松手、后台、断线、传感器陈旧、反馈停滞或异常时调用 stop_move。它不会自动上使能、解除急停、关机或控制云迹 UP 底盘。</w:t>
       </w:r>
     </w:p>
     <w:tbl>
@@ -3356,7 +3355,7 @@
                 <w:color w:val="202124"/>
                 <w:sz w:val="19"/>
               </w:rPr>
-              <w:t>手机网页</w:t>
+              <w:t>Android/HarmonyOS</w:t>
             </w:r>
           </w:p>
         </w:tc>
@@ -3389,7 +3388,7 @@
                 <w:color w:val="202124"/>
                 <w:sz w:val="19"/>
               </w:rPr>
-              <w:t>触摸操作</w:t>
+              <w:t>Rotation Vector + 触屏</w:t>
             </w:r>
           </w:p>
         </w:tc>
@@ -3422,7 +3421,7 @@
                 <w:color w:val="202124"/>
                 <w:sz w:val="19"/>
               </w:rPr>
-              <w:t>ΔX、ΔY、ΔZ、ΔR、open</w:t>
+              <w:t>旋转增量 / XYZ 速度意图</w:t>
             </w:r>
           </w:p>
         </w:tc>
@@ -3458,7 +3457,7 @@
                 <w:color w:val="202124"/>
                 <w:sz w:val="19"/>
               </w:rPr>
-              <w:t>FastAPI</w:t>
+              <w:t>lm3-teleop.v1</w:t>
             </w:r>
           </w:p>
         </w:tc>
@@ -3491,7 +3490,7 @@
                 <w:color w:val="202124"/>
                 <w:sz w:val="19"/>
               </w:rPr>
-              <w:t>JSON 请求</w:t>
+              <w:t>20Hz pose.sample</w:t>
             </w:r>
           </w:p>
         </w:tc>
@@ -3524,7 +3523,7 @@
                 <w:color w:val="202124"/>
                 <w:sz w:val="19"/>
               </w:rPr>
-              <w:t>标准化相对/绝对位姿</w:t>
+              <w:t>带租约、时间和置信度的严格消息</w:t>
             </w:r>
           </w:p>
         </w:tc>
@@ -3560,7 +3559,7 @@
                 <w:color w:val="202124"/>
                 <w:sz w:val="19"/>
               </w:rPr>
-              <w:t>运动学</w:t>
+              <w:t>Python 安全桥</w:t>
             </w:r>
           </w:p>
         </w:tc>
@@ -3593,7 +3592,7 @@
                 <w:color w:val="202124"/>
                 <w:sz w:val="19"/>
               </w:rPr>
-              <w:t>目标末端位姿</w:t>
+              <w:t>姿态增量 + LM3 反馈</w:t>
             </w:r>
           </w:p>
         </w:tc>
@@ -3626,7 +3625,7 @@
                 <w:color w:val="202124"/>
                 <w:sz w:val="19"/>
               </w:rPr>
-              <w:t>关节弧度 q1～q5</w:t>
+              <w:t>零线速度 + 受限 TCP 角速度</w:t>
             </w:r>
           </w:p>
         </w:tc>
@@ -3662,7 +3661,7 @@
                 <w:color w:val="202124"/>
                 <w:sz w:val="19"/>
               </w:rPr>
-              <w:t>校准映射</w:t>
+              <w:t>pylebai / LM3</w:t>
             </w:r>
           </w:p>
         </w:tc>
@@ -3695,7 +3694,7 @@
                 <w:color w:val="202124"/>
                 <w:sz w:val="19"/>
               </w:rPr>
-              <w:t>关节弧度</w:t>
+              <w:t>有限 speedl 命令</w:t>
             </w:r>
           </w:p>
         </w:tc>
@@ -3728,7 +3727,7 @@
                 <w:color w:val="202124"/>
                 <w:sz w:val="19"/>
               </w:rPr>
-              <w:t>舵机离散位置值</w:t>
+              <w:t>真实机械臂运动与反馈</w:t>
             </w:r>
           </w:p>
         </w:tc>
@@ -3764,7 +3763,7 @@
                 <w:color w:val="202124"/>
                 <w:sz w:val="19"/>
               </w:rPr>
-              <w:t>Feetech 总线</w:t>
+              <w:t>云迹 UP</w:t>
             </w:r>
           </w:p>
         </w:tc>
@@ -3797,7 +3796,7 @@
                 <w:color w:val="202124"/>
                 <w:sz w:val="19"/>
               </w:rPr>
-              <w:t>Goal_Position</w:t>
+              <w:t>独立安全状态</w:t>
             </w:r>
           </w:p>
         </w:tc>
@@ -3830,7 +3829,7 @@
                 <w:color w:val="202124"/>
                 <w:sz w:val="19"/>
               </w:rPr>
-              <w:t>舵机位置闭环动作</w:t>
+              <w:t>保持停止并锁定，不接收手机轮速</w:t>
             </w:r>
           </w:p>
         </w:tc>
@@ -4049,7 +4048,7 @@
                 <w:color w:val="202124"/>
                 <w:sz w:val="19"/>
               </w:rPr>
-              <w:t>手机网页</w:t>
+              <w:t>手机陀螺仪</w:t>
             </w:r>
           </w:p>
         </w:tc>
@@ -4082,7 +4081,7 @@
                 <w:color w:val="202124"/>
                 <w:sz w:val="19"/>
               </w:rPr>
-              <w:t>触摸按钮、末端位姿增量</w:t>
+              <w:t>系统融合 Rotation Vector</w:t>
             </w:r>
           </w:p>
         </w:tc>
@@ -4115,7 +4114,7 @@
                 <w:color w:val="202124"/>
                 <w:sz w:val="19"/>
               </w:rPr>
-              <w:t>相对位姿 → IK → 关节目标</w:t>
+              <w:t>相邻旋转 → 限速 TCP 角速度</w:t>
             </w:r>
           </w:p>
         </w:tc>
@@ -4148,7 +4147,7 @@
                 <w:color w:val="202124"/>
                 <w:sz w:val="19"/>
               </w:rPr>
-              <w:t>部署简单；适合演示和慢速操作；无力反馈</w:t>
+              <w:t>跨 Android/HarmonyOS；稳定 3DoF；无 XYZ 位置</w:t>
             </w:r>
           </w:p>
         </w:tc>
@@ -4283,7 +4282,7 @@
                 <w:color w:val="202124"/>
                 <w:sz w:val="19"/>
               </w:rPr>
-              <w:t>动作自然；适合模仿学习数据采集；需要第二套机械臂</w:t>
+              <w:t>动作自然；适合模仿学习；需要第二套机械臂</w:t>
             </w:r>
           </w:p>
         </w:tc>
@@ -4319,7 +4318,7 @@
                 <w:color w:val="202124"/>
                 <w:sz w:val="19"/>
               </w:rPr>
-              <w:t>VR 遥操</w:t>
+              <w:t>AR/VR 遥操</w:t>
             </w:r>
           </w:p>
         </w:tc>
@@ -4352,7 +4351,7 @@
                 <w:color w:val="202124"/>
                 <w:sz w:val="19"/>
               </w:rPr>
-              <w:t>手柄六自由度位姿、左右手、夹爪</w:t>
+              <w:t>空间位置 + 姿态 + 按键</w:t>
             </w:r>
           </w:p>
         </w:tc>
@@ -4385,7 +4384,7 @@
                 <w:color w:val="202124"/>
                 <w:sz w:val="19"/>
               </w:rPr>
-              <w:t>坐标系转换 → IK → 关节目标</w:t>
+              <w:t>坐标变换 → 末端目标 → IK</w:t>
             </w:r>
           </w:p>
         </w:tc>
@@ -4418,7 +4417,7 @@
                 <w:color w:val="202124"/>
                 <w:sz w:val="19"/>
               </w:rPr>
-              <w:t>空间操作自然；依赖 VR 设备和稳定网络</w:t>
+              <w:t>接近 6DoF；依赖 ARKit/WebXR/头显和平台支持</w:t>
             </w:r>
           </w:p>
         </w:tc>
@@ -4434,7 +4433,7 @@
         <w:pStyle w:val="Heading2"/>
       </w:pPr>
       <w:r>
-        <w:t>8.1 手机网页遥操</w:t>
+        <w:t>8.1 本仓库手机陀螺仪遥操</w:t>
       </w:r>
     </w:p>
     <w:p>
@@ -4447,7 +4446,7 @@
           <w:i w:val="0"/>
           <w:color w:val="202124"/>
         </w:rPr>
-        <w:t>手机承担的是触屏控制面板角色。每次触摸产生一小段笛卡尔位移或旋转，适合逐步移动、观察和调整。它没有操作者手臂的完整六自由度轨迹，也没有碰撞力反馈。</w:t>
+        <w:t>手机 Rotation Vector 只提供稳定的 3DoF 旋转；本实现将其映射到 TCP rx/ry/rz。手机 IMU 不能可靠测量 XYZ 平移，因此平移保留触屏轴键，且触屏与姿态 DEADMAN 不能并发。</w:t>
       </w:r>
     </w:p>
     <w:p>
@@ -4489,7 +4488,7 @@
           <w:i w:val="0"/>
           <w:color w:val="202124"/>
         </w:rPr>
-        <w:t>VR 应用通过 WebSocket 或 UDP 发送手柄的绝对位置、Pitch/Yaw/Roll、左右手来源和夹爪状态。后端先处理 Unity/VR 坐标系与机器人坐标系的轴向差异，再进入同一套 IK 和电机执行链。</w:t>
+        <w:t>Phosphobot VR 应用通过 WebSocket 或 UDP 发送 Meta Quest 手柄的绝对位置、Pitch/Yaw/Roll、左右手来源和夹爪状态。后端处理 Unity/VR 与机器人坐标差异后进入 IK 和硬件执行链；它是架构参考，不是手机陀螺仪实现。</w:t>
       </w:r>
     </w:p>
     <w:p>
@@ -4546,7 +4545,7 @@
         <w:pStyle w:val="Heading2"/>
       </w:pPr>
       <w:r>
-        <w:t>9.1 并非完整的笛卡尔物理反馈闭环</w:t>
+        <w:t>9.1 软件反馈不是硬实时安全闭环</w:t>
       </w:r>
     </w:p>
     <w:p>
@@ -4559,7 +4558,7 @@
           <w:i w:val="0"/>
           <w:color w:val="202124"/>
         </w:rPr>
-        <w:t>相对运动接口默认主要根据仿真模型中保存的状态计算下一目标，并不在每条手机指令前强制读取所有真实舵机位置。快速位置闭环位于舵机内部。若机械臂被外力推动、发生明显跟踪误差或校准不准确，虚拟状态可能与实体状态出现偏差。</w:t>
+        <w:t>安全桥持续读取 LM3 关节与 TCP 反馈，并检测连续非零命令期间的反馈停滞；但 Windows、Python、Wi-Fi 和普通 SDK 都不是硬实时链路。300ms watchdog、有限命令持续时间、独立 stop_move 与物理急停必须同时保留。</w:t>
       </w:r>
     </w:p>
     <w:p>
@@ -4579,7 +4578,7 @@
           <w:rFonts w:ascii="Calibri" w:hAnsi="Calibri" w:eastAsia="Microsoft YaHei"/>
           <w:color w:val="202124"/>
         </w:rPr>
-        <w:t>手机触摸事件和浏览器控制循环；</w:t>
+        <w:t>手机 Rotation Vector 采样、融合与 App 调度；</w:t>
       </w:r>
     </w:p>
     <w:p>
@@ -4591,7 +4590,7 @@
           <w:rFonts w:ascii="Calibri" w:hAnsi="Calibri" w:eastAsia="Microsoft YaHei"/>
           <w:color w:val="202124"/>
         </w:rPr>
-        <w:t>Wi-Fi HTTP 往返延迟与抖动；</w:t>
+        <w:t>20Hz WebSocket 往返延迟与抖动；</w:t>
       </w:r>
     </w:p>
     <w:p>
@@ -4603,7 +4602,7 @@
           <w:rFonts w:ascii="Calibri" w:hAnsi="Calibri" w:eastAsia="Microsoft YaHei"/>
           <w:color w:val="202124"/>
         </w:rPr>
-        <w:t>FastAPI 请求调度和单位换算；</w:t>
+        <w:t>服务端 JSON、租约、时序、置信度和跳变校验；</w:t>
       </w:r>
     </w:p>
     <w:p>
@@ -4615,7 +4614,7 @@
           <w:rFonts w:ascii="Calibri" w:hAnsi="Calibri" w:eastAsia="Microsoft YaHei"/>
           <w:color w:val="202124"/>
         </w:rPr>
-        <w:t>正/逆运动学计算；</w:t>
+        <w:t>旋转增量到受限 TCP 角速度的映射；</w:t>
       </w:r>
     </w:p>
     <w:p>
@@ -4627,7 +4626,7 @@
           <w:rFonts w:ascii="Calibri" w:hAnsi="Calibri" w:eastAsia="Microsoft YaHei"/>
           <w:color w:val="202124"/>
         </w:rPr>
-        <w:t>USB 串口与 Feetech 总线写入；</w:t>
+        <w:t>pylebai、LM3 控制器和状态回读；</w:t>
       </w:r>
     </w:p>
     <w:p>
@@ -4639,7 +4638,7 @@
           <w:rFonts w:ascii="Calibri" w:hAnsi="Calibri" w:eastAsia="Microsoft YaHei"/>
           <w:color w:val="202124"/>
         </w:rPr>
-        <w:t>舵机内部位置控制和机械惯性。</w:t>
+        <w:t>机械臂内部控制周期、惯性与 stop_move 响应。</w:t>
       </w:r>
     </w:p>
     <w:p>
@@ -4652,7 +4651,7 @@
           <w:i w:val="0"/>
           <w:color w:val="202124"/>
         </w:rPr>
-        <w:t>网页侧把发送频率限制在约 30Hz。局域网正常时可获得较平滑的演示效果，但它不是工业实时总线；网络拥塞和多个未完成的 HTTP 请求可能造成迟滞或动作不均匀。</w:t>
+        <w:t>客户端最多发送 20Hz 姿态增量；300ms 内没有新的有效 DEADMAN 运动命令时服务端失败关闭。局域网仍不是工业实时总线，必须用模拟回放和真机测量记录延迟与停止距离。</w:t>
       </w:r>
     </w:p>
     <w:p>
@@ -4681,14 +4680,13 @@
           <w:b/>
           <w:color w:val="9B1C1C"/>
         </w:rPr>
-        <w:t xml:space="preserve">高风险配置  </w:t>
+        <w:t>参考项目风险  Phosphobot 默认监听 0.0.0.0、CORS 宽松，基础移动接口也未体现本仓库要求的强认证和单写入者租约。本实现默认环回、局域网双重显式开启，并要求 token、WSS、DEADMAN、限速和 watchdog；仍不得映射到公网。</w:t>
       </w:r>
       <w:r>
         <w:rPr>
           <w:rFonts w:ascii="Calibri" w:hAnsi="Calibri" w:eastAsia="Microsoft YaHei"/>
           <w:color w:val="202124"/>
         </w:rPr>
-        <w:t>Phosphobot 默认监听 0.0.0.0，源码中的 CORS 允许所有来源，而基础移动接口没有体现强制认证。不要把控制端口映射到公网，也不要在不可信公共 Wi-Fi 上运行。</w:t>
       </w:r>
     </w:p>
     <w:p>
@@ -4696,7 +4694,7 @@
         <w:pStyle w:val="Heading1"/>
       </w:pPr>
       <w:r>
-        <w:t>10. 建议的实际使用步骤</w:t>
+        <w:t>10. LM3-UP 建议验证步骤</w:t>
       </w:r>
     </w:p>
     <w:p>
@@ -4708,7 +4706,7 @@
           <w:rFonts w:ascii="Calibri" w:hAnsi="Calibri" w:eastAsia="Microsoft YaHei"/>
           <w:color w:val="202124"/>
         </w:rPr>
-        <w:t>将 SO-ARM 牢固固定，清空机械臂周围至少 1 米的人员和贵重物品。</w:t>
+        <w:t>确认云迹 UP 底盘停止并由独立流程锁定，清空 LM3 工作区，现场人员可直接触达物理急停。</w:t>
       </w:r>
     </w:p>
     <w:p>
@@ -4720,7 +4718,7 @@
           <w:rFonts w:ascii="Calibri" w:hAnsi="Calibri" w:eastAsia="Microsoft YaHei"/>
           <w:color w:val="202124"/>
         </w:rPr>
-        <w:t>完成每个舵机的 ID、波特率和零点初始化，再完成 Phosphobot 软件二次校准。</w:t>
+        <w:t>先启动模拟后端，连接 Android/HarmonyOS 客户端并取得单一控制租约。</w:t>
       </w:r>
     </w:p>
     <w:p>
@@ -4732,7 +4730,7 @@
           <w:rFonts w:ascii="Calibri" w:hAnsi="Calibri" w:eastAsia="Microsoft YaHei"/>
           <w:color w:val="202124"/>
         </w:rPr>
-        <w:t>使用 USB 数据线和独立电源连接机械臂与电脑，确认电源和总线线缆稳定。</w:t>
+        <w:t>启用 Rotation Vector，按规定握持手机，等待跟踪稳定后显式归零。</w:t>
       </w:r>
     </w:p>
     <w:p>
@@ -4744,7 +4742,7 @@
           <w:rFonts w:ascii="Calibri" w:hAnsi="Calibri" w:eastAsia="Microsoft YaHei"/>
           <w:color w:val="202124"/>
         </w:rPr>
-        <w:t>在电脑上启动 phosphobot run，并确认实际监听端口是 80、8020 或其他回退端口。</w:t>
+        <w:t>在模拟器逐轴验向，确认手机旋转与 TCP rx/ry/rz 的方向、符号和速度符合预期。</w:t>
       </w:r>
     </w:p>
     <w:p>
@@ -4756,7 +4754,7 @@
           <w:rFonts w:ascii="Calibri" w:hAnsi="Calibri" w:eastAsia="Microsoft YaHei"/>
           <w:color w:val="202124"/>
         </w:rPr>
-        <w:t>把手机和电脑连接到同一个可信私人局域网。</w:t>
+        <w:t>持续按住姿态 DEADMAN；确认首帧只 priming，随后才以最多 20Hz 发送相邻旋转增量。</w:t>
       </w:r>
     </w:p>
     <w:p>
@@ -4768,7 +4766,7 @@
           <w:rFonts w:ascii="Calibri" w:hAnsi="Calibri" w:eastAsia="Microsoft YaHei"/>
           <w:color w:val="202124"/>
         </w:rPr>
-        <w:t>在手机浏览器打开 http://电脑局域网IP:端口，而不是 0.0.0.0。</w:t>
+        <w:t>验证松手、切后台、断网、时间倒退、低置信度、样本陈旧和姿态跳变都会立即停止并撤销租约。</w:t>
       </w:r>
     </w:p>
     <w:p>
@@ -4780,7 +4778,7 @@
           <w:rFonts w:ascii="Calibri" w:hAnsi="Calibri" w:eastAsia="Microsoft YaHei"/>
           <w:color w:val="202124"/>
         </w:rPr>
-        <w:t>从最低速度和最小位移开始，先验证每个方向的含义是否正确。</w:t>
+        <w:t>真机只在底盘锁定、空载、最低速度和缩小工作空间内进行，并记录 TCP/关节反馈与实际停止延迟。</w:t>
       </w:r>
     </w:p>
     <w:p>
@@ -4792,7 +4790,7 @@
           <w:rFonts w:ascii="Calibri" w:hAnsi="Calibri" w:eastAsia="Microsoft YaHei"/>
           <w:color w:val="202124"/>
         </w:rPr>
-        <w:t>操作过程中保持能够立即断电，不将服务端口暴露到公网。</w:t>
+        <w:t>示范数据保留原始旋转增量、calibration_id、传感器/服务端时间、实际反馈、钳制和 watchdog 事件；禁止把被拒绝命令当作训练真值。</w:t>
       </w:r>
     </w:p>
     <w:p>
@@ -5584,7 +5582,7 @@
           <w:i w:val="0"/>
           <w:color w:val="202124"/>
         </w:rPr>
-        <w:t>手机遥操 SO-ARM 的关键不是手机直接发舵机角度，而是把手机变成浏览器输入终端：触摸操作被转换为末端位姿增量，电脑通过 Phosphobot 完成坐标处理、逆运动学和校准映射，再把目标位置写入 Feetech 舵机。</w:t>
+        <w:t>Seeed Wiki 没有提供手机陀螺仪遥操源码，Phosphobot 提供的是 Meta Quest/VR 路径；LeRobot v0.4.2 的手机方案依赖 Android WebXR 或 iOS ARKit。针对 LM3-UP，本仓库选择 Android/HarmonyOS 原生 Rotation Vector，只控制 TCP 旋转，平移保留触屏输入。</w:t>
       </w:r>
     </w:p>
     <w:p>
@@ -5597,7 +5595,7 @@
           <w:i w:val="0"/>
           <w:color w:val="202124"/>
         </w:rPr>
-        <w:t>这种方案适合教学、演示和数据采集准备，但不具备安全认证、力反馈或强实时保证。稳定校准、可信局域网、低速测试和可立即断电是实际使用的必要条件。</w:t>
+        <w:t>这种实现具备归零、按住式 DEADMAN、20Hz 限流、传感器新鲜度/跳变检查、单租约和 300ms watchdog，但尚未通过 LM3-UP 真机运动与无线延迟验收。软件停止不能替代物理急停。</w:t>
       </w:r>
     </w:p>
     <w:p>
@@ -5625,7 +5623,7 @@
           <w:rFonts w:ascii="Calibri" w:hAnsi="Calibri" w:eastAsia="Microsoft YaHei"/>
           <w:color w:val="202124"/>
         </w:rPr>
-        <w:t>手机负责“告诉机械臂想往哪里走”，电脑负责“算出每个关节该转多少”，舵机负责“在本地位置闭环中真正把机械臂转过去”。</w:t>
+        <w:t>手机陀螺仪只负责“告诉机械臂姿态如何变化”，安全桥负责“判断这次变化能否执行并限制速度”，LM3 控制器负责“驱动真实关节”；XYZ 平移不能由陀螺仪凭空推算。</w:t>
       </w:r>
     </w:p>
     <w:p>
@@ -5692,7 +5690,7 @@
             <w:color w:val="2E74B5"/>
             <w:u w:val="single"/>
           </w:rPr>
-          <w:t>Phosphobot：手机可用的触摸控制页面</w:t>
+          <w:t>Phosphobot：VR 控制页（Meta Quest 设备说明）</w:t>
         </w:r>
       </w:hyperlink>
     </w:p>
@@ -5707,7 +5705,7 @@
             <w:color w:val="2E74B5"/>
             <w:u w:val="single"/>
           </w:rPr>
-          <w:t>Phosphobot：移动接口与遥操接口</w:t>
+          <w:t>Phosphobot：/move/teleop/ws WebSocket 入口</w:t>
         </w:r>
       </w:hyperlink>
     </w:p>
@@ -5722,7 +5720,7 @@
             <w:color w:val="2E74B5"/>
             <w:u w:val="single"/>
           </w:rPr>
-          <w:t>Phosphobot：正/逆运动学与关节执行</w:t>
+          <w:t>Phosphobot：AppControlData Meta Quest 模型与坐标映射</w:t>
         </w:r>
       </w:hyperlink>
     </w:p>
@@ -5737,7 +5735,7 @@
             <w:color w:val="2E74B5"/>
             <w:u w:val="single"/>
           </w:rPr>
-          <w:t>Phosphobot：SO-ARM 与 Feetech 总线实现</w:t>
+          <w:t>LeRobot v0.4.2：Phone Teleoperator 文档</w:t>
         </w:r>
       </w:hyperlink>
     </w:p>
@@ -5752,7 +5750,7 @@
             <w:color w:val="2E74B5"/>
             <w:u w:val="single"/>
           </w:rPr>
-          <w:t>Phosphobot：网络绑定和 CORS 配置</w:t>
+          <w:t>本仓库：LM3-UP 手机遥操协议</w:t>
         </w:r>
       </w:hyperlink>
     </w:p>
@@ -5773,7 +5771,7 @@
           <w:rFonts w:ascii="Calibri" w:hAnsi="Calibri" w:eastAsia="Microsoft YaHei"/>
           <w:color w:val="202124"/>
         </w:rPr>
-        <w:t>已验证：Git 分支、提交、工作树状态、目录与入口、配置语法、相关 Wiki 文档和 Phosphobot 控制链。</w:t>
+        <w:t>已验证：Wiki 固定提交与内容边界、Phosphobot Meta Quest VR 控制链、LeRobot v0.4.2 Phone Teleoperator，以及本仓库 Android/HarmonyOS Rotation Vector 与 Python 协议实现。</w:t>
       </w:r>
     </w:p>
     <w:p>
@@ -5785,7 +5783,7 @@
           <w:rFonts w:ascii="Calibri" w:hAnsi="Calibri" w:eastAsia="Microsoft YaHei"/>
           <w:color w:val="202124"/>
         </w:rPr>
-        <w:t>未验证：真实 SO-ARM 硬件运行、手机浏览器兼容性、Windows 防火墙配置、实际 Wi-Fi 延迟和碰撞安全性能。</w:t>
+        <w:t>未验证：真实手机传感器表现、Android/HarmonyOS 设备差异、无线时延、LM3-UP 轴向/速度/停止距离、夹爪和 VLA 真机端到端安全性。</w:t>
       </w:r>
     </w:p>
     <w:p>
@@ -5797,7 +5795,7 @@
           <w:rFonts w:ascii="Calibri" w:hAnsi="Calibri" w:eastAsia="Microsoft YaHei"/>
           <w:color w:val="202124"/>
         </w:rPr>
-        <w:t>因此本文对源码结构和控制原理的描述有直接证据；对真实设备手感、安全距离和稳定性的判断仍需实际硬件回放测试。</w:t>
+        <w:t>因此本文对源码结构、参考项目边界和本仓库设计有直接证据；对实体设备手感、精度、稳定性和安全距离仍必须通过固定底盘、低速空载的真实回放验证。</w:t>
       </w:r>
     </w:p>
     <w:sectPr>

</xml_diff>